<commit_message>
implementing and putting and adding the new features into the platform to maximize the way it operates and adding all necessary concepts and resources
</commit_message>
<xml_diff>
--- a/Platform to be built.docx
+++ b/Platform to be built.docx
@@ -2506,17 +2506,36 @@
           <w:shd w:fill="auto" w:val="clear"/>
         </w:rPr>
       </w:pPr>
-      <w:r>
-        <w:rPr>
-          <w:rFonts w:ascii="Times New Roman" w:hAnsi="Times New Roman" w:cs="Times New Roman" w:eastAsia="Times New Roman"/>
-          <w:color w:val="auto"/>
-          <w:spacing w:val="0"/>
-          <w:position w:val="0"/>
-          <w:sz w:val="24"/>
-          <w:shd w:fill="auto" w:val="clear"/>
-        </w:rPr>
-        <w:t xml:space="preserve">PLEASE INSTALL EVERY SINGLE NECESSITY FOR MY PLATFORM TO RUN REALLY WELL! AND GIVE THE STEPS TO RUN IT LOCALLY ON WINDOWS POWERSHELL AS AN ADMIN! PLEASE ALL THE STUFFS PUT THEM IN ORDER TO THE MAXIMUM AND EVERYTHING IN LINE TO MAKE SURE THAT FROM HERE I GO TO DEPLOY IT DIRECTLY! PLEASE I WANT THIS ONE FINAL VERSION WORKING WITHOUT ANY SINGLE AND ANY SINGLE ERRRO JUST THE PLATFORM WORKING! WHETHER ITS JS OR WHATEVER IT IS JUST MAKE SURE THAT EVERY THING IS WORKING FREELY WITHOUT ANY ERROR! </w:t>
-      </w:r>
+    </w:p>
+    <w:p>
+      <w:pPr>
+        <w:spacing w:before="100" w:after="100" w:line="240"/>
+        <w:ind w:right="0" w:left="720" w:firstLine="0"/>
+        <w:jc w:val="left"/>
+        <w:rPr>
+          <w:rFonts w:ascii="Times New Roman" w:hAnsi="Times New Roman" w:cs="Times New Roman" w:eastAsia="Times New Roman"/>
+          <w:color w:val="auto"/>
+          <w:spacing w:val="0"/>
+          <w:position w:val="0"/>
+          <w:sz w:val="24"/>
+          <w:shd w:fill="auto" w:val="clear"/>
+        </w:rPr>
+      </w:pPr>
+    </w:p>
+    <w:p>
+      <w:pPr>
+        <w:spacing w:before="100" w:after="100" w:line="240"/>
+        <w:ind w:right="0" w:left="720" w:firstLine="0"/>
+        <w:jc w:val="left"/>
+        <w:rPr>
+          <w:rFonts w:ascii="Times New Roman" w:hAnsi="Times New Roman" w:cs="Times New Roman" w:eastAsia="Times New Roman"/>
+          <w:color w:val="auto"/>
+          <w:spacing w:val="0"/>
+          <w:position w:val="0"/>
+          <w:sz w:val="24"/>
+          <w:shd w:fill="auto" w:val="clear"/>
+        </w:rPr>
+      </w:pPr>
     </w:p>
     <w:p>
       <w:pPr>

</xml_diff>

<commit_message>
Sorting out the issue of "Request failed" error that was coming at the loh in page
</commit_message>
<xml_diff>
--- a/Platform to be built.docx
+++ b/Platform to be built.docx
@@ -2476,6 +2476,121 @@
           <w:shd w:fill="auto" w:val="clear"/>
         </w:rPr>
       </w:pPr>
+      <w:r>
+        <w:rPr>
+          <w:rFonts w:ascii="Times New Roman" w:hAnsi="Times New Roman" w:cs="Times New Roman" w:eastAsia="Times New Roman"/>
+          <w:color w:val="auto"/>
+          <w:spacing w:val="0"/>
+          <w:position w:val="0"/>
+          <w:sz w:val="24"/>
+          <w:shd w:fill="auto" w:val="clear"/>
+        </w:rPr>
+        <w:t xml:space="preserve">PS C:\WINDOWS\system32&gt; # Generate a 64-character random secret (recommended)</w:t>
+      </w:r>
+    </w:p>
+    <w:p>
+      <w:pPr>
+        <w:spacing w:before="100" w:after="100" w:line="240"/>
+        <w:ind w:right="0" w:left="720" w:firstLine="0"/>
+        <w:jc w:val="left"/>
+        <w:rPr>
+          <w:rFonts w:ascii="Times New Roman" w:hAnsi="Times New Roman" w:cs="Times New Roman" w:eastAsia="Times New Roman"/>
+          <w:color w:val="auto"/>
+          <w:spacing w:val="0"/>
+          <w:position w:val="0"/>
+          <w:sz w:val="24"/>
+          <w:shd w:fill="auto" w:val="clear"/>
+        </w:rPr>
+      </w:pPr>
+      <w:r>
+        <w:rPr>
+          <w:rFonts w:ascii="Times New Roman" w:hAnsi="Times New Roman" w:cs="Times New Roman" w:eastAsia="Times New Roman"/>
+          <w:color w:val="auto"/>
+          <w:spacing w:val="0"/>
+          <w:position w:val="0"/>
+          <w:sz w:val="24"/>
+          <w:shd w:fill="auto" w:val="clear"/>
+        </w:rPr>
+        <w:t xml:space="preserve">&gt;&gt; $jwtSecret = -join ((65..90) + (97..122) + (48..57) | Get-Random -Count 64 | % {[char]$_})</w:t>
+      </w:r>
+    </w:p>
+    <w:p>
+      <w:pPr>
+        <w:spacing w:before="100" w:after="100" w:line="240"/>
+        <w:ind w:right="0" w:left="720" w:firstLine="0"/>
+        <w:jc w:val="left"/>
+        <w:rPr>
+          <w:rFonts w:ascii="Times New Roman" w:hAnsi="Times New Roman" w:cs="Times New Roman" w:eastAsia="Times New Roman"/>
+          <w:color w:val="auto"/>
+          <w:spacing w:val="0"/>
+          <w:position w:val="0"/>
+          <w:sz w:val="24"/>
+          <w:shd w:fill="auto" w:val="clear"/>
+        </w:rPr>
+      </w:pPr>
+      <w:r>
+        <w:rPr>
+          <w:rFonts w:ascii="Times New Roman" w:hAnsi="Times New Roman" w:cs="Times New Roman" w:eastAsia="Times New Roman"/>
+          <w:color w:val="auto"/>
+          <w:spacing w:val="0"/>
+          <w:position w:val="0"/>
+          <w:sz w:val="24"/>
+          <w:shd w:fill="auto" w:val="clear"/>
+        </w:rPr>
+        <w:t xml:space="preserve">&gt;&gt; Write-Host "Your JWT Secret: $jwtSecret" -ForegroundColor Green</w:t>
+      </w:r>
+    </w:p>
+    <w:p>
+      <w:pPr>
+        <w:spacing w:before="100" w:after="100" w:line="240"/>
+        <w:ind w:right="0" w:left="720" w:firstLine="0"/>
+        <w:jc w:val="left"/>
+        <w:rPr>
+          <w:rFonts w:ascii="Times New Roman" w:hAnsi="Times New Roman" w:cs="Times New Roman" w:eastAsia="Times New Roman"/>
+          <w:color w:val="auto"/>
+          <w:spacing w:val="0"/>
+          <w:position w:val="0"/>
+          <w:sz w:val="24"/>
+          <w:shd w:fill="auto" w:val="clear"/>
+        </w:rPr>
+      </w:pPr>
+      <w:r>
+        <w:rPr>
+          <w:rFonts w:ascii="Times New Roman" w:hAnsi="Times New Roman" w:cs="Times New Roman" w:eastAsia="Times New Roman"/>
+          <w:color w:val="auto"/>
+          <w:spacing w:val="0"/>
+          <w:position w:val="0"/>
+          <w:sz w:val="24"/>
+          <w:shd w:fill="auto" w:val="clear"/>
+        </w:rPr>
+        <w:t xml:space="preserve">Your JWT Secret: chv0EyT6qWw4ijlpPbZVxLGMOYUIaAf8nKd1NrFz7XQugtkJmCRH35e9osSDB2</w:t>
+      </w:r>
+    </w:p>
+    <w:p>
+      <w:pPr>
+        <w:spacing w:before="100" w:after="100" w:line="240"/>
+        <w:ind w:right="0" w:left="720" w:firstLine="0"/>
+        <w:jc w:val="left"/>
+        <w:rPr>
+          <w:rFonts w:ascii="Times New Roman" w:hAnsi="Times New Roman" w:cs="Times New Roman" w:eastAsia="Times New Roman"/>
+          <w:color w:val="auto"/>
+          <w:spacing w:val="0"/>
+          <w:position w:val="0"/>
+          <w:sz w:val="24"/>
+          <w:shd w:fill="auto" w:val="clear"/>
+        </w:rPr>
+      </w:pPr>
+      <w:r>
+        <w:rPr>
+          <w:rFonts w:ascii="Times New Roman" w:hAnsi="Times New Roman" w:cs="Times New Roman" w:eastAsia="Times New Roman"/>
+          <w:color w:val="auto"/>
+          <w:spacing w:val="0"/>
+          <w:position w:val="0"/>
+          <w:sz w:val="24"/>
+          <w:shd w:fill="auto" w:val="clear"/>
+        </w:rPr>
+        <w:t xml:space="preserve">PS C:\WINDOWS\system32&gt;</w:t>
+      </w:r>
     </w:p>
     <w:p>
       <w:pPr>

</xml_diff>